<commit_message>
Update design brief with platform, Zotero, database and scoping review decisions
Co-Authored-By: Claude Opus 5.5 <noreply@anthropic.com>
Claude-Session: https://claude.ai/code/session_01SZ8sRLoFheT4VCmHysNqST
</commit_message>
<xml_diff>
--- a/docs/Literature_Assistant_Design_Brief.docx
+++ b/docs/Literature_Assistant_Design_Brief.docx
@@ -57,7 +57,7 @@
           <w:sz w:val="20"/>
           <w:szCs w:val="20"/>
         </w:rPr>
-        <w:t xml:space="preserve">Prepared for Ernest Konadu Appiah, 28 September 2026. Status: draft for discussion, nothing built yet.</w:t>
+        <w:t xml:space="preserve">Prepared for Ernest Konadu Appiah, 28 September 2026. Version 2: updated with decisions on platform, reference manager, databases and review type. Nothing built yet.</w:t>
       </w:r>
     </w:p>
     <w:p>
@@ -407,7 +407,7 @@
                 <w:sz w:val="19"/>
                 <w:szCs w:val="19"/>
               </w:rPr>
-              <w:t xml:space="preserve">Systematic or scoping, fully logged</w:t>
+              <w:t xml:space="preserve">Scoping review (JBI method, PRISMA-ScR), fully logged</w:t>
             </w:r>
           </w:p>
         </w:tc>
@@ -845,7 +845,7 @@
                 <w:sz w:val="19"/>
                 <w:szCs w:val="19"/>
               </w:rPr>
-              <w:t xml:space="preserve">Plain language question in; PICO or PEO breakdown and a Boolean search string with MeSH terms and synonyms out. Strategy is editable and versioned, and is translated for each database.</w:t>
+              <w:t xml:space="preserve">Plain language question in; framework breakdown (PCC for scoping reviews: Population, Concept, Context; PICO for effectiveness questions) and a Boolean search string with MeSH terms and synonyms out. Strategy is editable and versioned, and is translated for each database.</w:t>
             </w:r>
           </w:p>
         </w:tc>
@@ -1127,7 +1127,7 @@
                 <w:sz w:val="19"/>
                 <w:szCs w:val="19"/>
               </w:rPr>
-              <w:t xml:space="preserve">6. Extract</w:t>
+              <w:t xml:space="preserve">6. Extract or chart</w:t>
             </w:r>
           </w:p>
         </w:tc>
@@ -1156,7 +1156,7 @@
                 <w:sz w:val="19"/>
                 <w:szCs w:val="19"/>
               </w:rPr>
-              <w:t xml:space="preserve">Fills the project's extraction form from each included paper, quoting the passage each value came from. You verify each value. Exports to Excel.</w:t>
+              <w:t xml:space="preserve">Fills the project's extraction form (called a charting form in a scoping review) from each included paper, quoting the passage each value came from. You verify each value. Exports to Excel.</w:t>
             </w:r>
           </w:p>
         </w:tc>
@@ -1404,7 +1404,7 @@
                 <w:sz w:val="19"/>
                 <w:szCs w:val="19"/>
               </w:rPr>
-              <w:t xml:space="preserve">RIS and BibTeX for Zotero, Excel tables, search log, PRISMA 2020 flow diagram.</w:t>
+              <w:t xml:space="preserve">Send records straight to a Zotero collection, or export RIS and BibTeX; Excel tables, search log, PRISMA-ScR or PRISMA 2020 flow diagram depending on review type.</w:t>
             </w:r>
           </w:p>
         </w:tc>
@@ -1421,7 +1421,15 @@
         <w:spacing w:after="120" w:before="320"/>
       </w:pPr>
       <w:r>
-        <w:t xml:space="preserve">5. Objective 1 extraction form (draft)</w:t>
+        <w:t xml:space="preserve">5. Objective 1 charting form (draft)</w:t>
+      </w:r>
+    </w:p>
+    <w:p>
+      <w:pPr>
+        <w:spacing w:after="120" w:line="276"/>
+      </w:pPr>
+      <w:r>
+        <w:t xml:space="preserve">Objective 1 is a scoping review following the JBI methodology and reported with PRISMA-ScR. The question is framed with PCC. Population: women or couples undergoing IVF or ICSI. Concept: reported outcomes, their definitions and denominators, and the statistical methods used. Context: sub-Saharan Africa. The protocol can be registered on OSF, since PROSPERO does not accept scoping reviews.</w:t>
       </w:r>
     </w:p>
     <w:p>
@@ -2223,7 +2231,7 @@
                 <w:sz w:val="19"/>
                 <w:szCs w:val="19"/>
               </w:rPr>
-              <w:t xml:space="preserve">Quality notes</w:t>
+              <w:t xml:space="preserve">Reporting notes</w:t>
             </w:r>
           </w:p>
         </w:tc>
@@ -2252,7 +2260,7 @@
                 <w:sz w:val="19"/>
                 <w:szCs w:val="19"/>
               </w:rPr>
-              <w:t xml:space="preserve">Tool to be agreed with supervisor (for example a modified Newcastle Ottawa scale)</w:t>
+              <w:t xml:space="preserve">Critical appraisal is not required in a scoping review. An optional note on reporting completeness can be kept, since poor reporting is itself a finding for the thesis</w:t>
             </w:r>
           </w:p>
         </w:tc>
@@ -2901,7 +2909,7 @@
                 <w:sz w:val="19"/>
                 <w:szCs w:val="19"/>
               </w:rPr>
-              <w:t xml:space="preserve">If university provides</w:t>
+              <w:t xml:space="preserve">Not available for now</w:t>
             </w:r>
           </w:p>
         </w:tc>
@@ -2930,7 +2938,7 @@
                 <w:sz w:val="19"/>
                 <w:szCs w:val="19"/>
               </w:rPr>
-              <w:t xml:space="preserve">Import exports; API later if a key is available</w:t>
+              <w:t xml:space="preserve">Left out of version 1. If access comes through the university later, exports can be imported with no changes to the app</w:t>
             </w:r>
           </w:p>
         </w:tc>
@@ -3172,7 +3180,7 @@
                 <w:sz w:val="19"/>
                 <w:szCs w:val="19"/>
               </w:rPr>
-              <w:t xml:space="preserve">Language</w:t>
+              <w:t xml:space="preserve">Computer</w:t>
             </w:r>
           </w:p>
         </w:tc>
@@ -3200,7 +3208,7 @@
                 <w:sz w:val="19"/>
                 <w:szCs w:val="19"/>
               </w:rPr>
-              <w:t xml:space="preserve">Python</w:t>
+              <w:t xml:space="preserve">Windows 10 or 11 laptop</w:t>
             </w:r>
           </w:p>
         </w:tc>
@@ -3234,6 +3242,68 @@
                 <w:sz w:val="19"/>
                 <w:szCs w:val="19"/>
               </w:rPr>
+              <w:t xml:space="preserve">Language</w:t>
+            </w:r>
+          </w:p>
+        </w:tc>
+        <w:tc>
+          <w:tcPr>
+            <w:tcW w:type="dxa" w:w="6426"/>
+            <w:tcBorders>
+              <w:top w:val="single" w:color="BFBFBF" w:sz="4"/>
+              <w:left w:val="single" w:color="BFBFBF" w:sz="4"/>
+              <w:bottom w:val="single" w:color="BFBFBF" w:sz="4"/>
+              <w:right w:val="single" w:color="BFBFBF" w:sz="4"/>
+            </w:tcBorders>
+            <w:shd w:fill="F2F6FA" w:color="auto" w:val="clear"/>
+            <w:tcMar>
+              <w:top w:type="dxa" w:w="60"/>
+              <w:left w:type="dxa" w:w="100"/>
+              <w:bottom w:type="dxa" w:w="60"/>
+              <w:right w:type="dxa" w:w="100"/>
+            </w:tcMar>
+          </w:tcPr>
+          <w:p>
+            <w:r>
+              <w:rPr>
+                <w:b w:val="false"/>
+                <w:bCs w:val="false"/>
+                <w:sz w:val="19"/>
+                <w:szCs w:val="19"/>
+              </w:rPr>
+              <w:t xml:space="preserve">Python, installed once from python.org</w:t>
+            </w:r>
+          </w:p>
+        </w:tc>
+      </w:tr>
+      <w:tr>
+        <w:trPr>
+          <w:tblHeader w:val="off"/>
+        </w:trPr>
+        <w:tc>
+          <w:tcPr>
+            <w:tcW w:type="dxa" w:w="2600"/>
+            <w:tcBorders>
+              <w:top w:val="single" w:color="BFBFBF" w:sz="4"/>
+              <w:left w:val="single" w:color="BFBFBF" w:sz="4"/>
+              <w:bottom w:val="single" w:color="BFBFBF" w:sz="4"/>
+              <w:right w:val="single" w:color="BFBFBF" w:sz="4"/>
+            </w:tcBorders>
+            <w:tcMar>
+              <w:top w:type="dxa" w:w="60"/>
+              <w:left w:type="dxa" w:w="100"/>
+              <w:bottom w:type="dxa" w:w="60"/>
+              <w:right w:type="dxa" w:w="100"/>
+            </w:tcMar>
+          </w:tcPr>
+          <w:p>
+            <w:r>
+              <w:rPr>
+                <w:b w:val="false"/>
+                <w:bCs w:val="false"/>
+                <w:sz w:val="19"/>
+                <w:szCs w:val="19"/>
+              </w:rPr>
               <w:t xml:space="preserve">Interface</w:t>
             </w:r>
           </w:p>
@@ -3247,6 +3317,39 @@
               <w:bottom w:val="single" w:color="BFBFBF" w:sz="4"/>
               <w:right w:val="single" w:color="BFBFBF" w:sz="4"/>
             </w:tcBorders>
+            <w:tcMar>
+              <w:top w:type="dxa" w:w="60"/>
+              <w:left w:type="dxa" w:w="100"/>
+              <w:bottom w:type="dxa" w:w="60"/>
+              <w:right w:type="dxa" w:w="100"/>
+            </w:tcMar>
+          </w:tcPr>
+          <w:p>
+            <w:r>
+              <w:rPr>
+                <w:b w:val="false"/>
+                <w:bCs w:val="false"/>
+                <w:sz w:val="19"/>
+                <w:szCs w:val="19"/>
+              </w:rPr>
+              <w:t xml:space="preserve">Streamlit web app opened in the browser; runs on your laptop. Started by double clicking a desktop shortcut, no command line needed</w:t>
+            </w:r>
+          </w:p>
+        </w:tc>
+      </w:tr>
+      <w:tr>
+        <w:trPr>
+          <w:tblHeader w:val="off"/>
+        </w:trPr>
+        <w:tc>
+          <w:tcPr>
+            <w:tcW w:type="dxa" w:w="2600"/>
+            <w:tcBorders>
+              <w:top w:val="single" w:color="BFBFBF" w:sz="4"/>
+              <w:left w:val="single" w:color="BFBFBF" w:sz="4"/>
+              <w:bottom w:val="single" w:color="BFBFBF" w:sz="4"/>
+              <w:right w:val="single" w:color="BFBFBF" w:sz="4"/>
+            </w:tcBorders>
             <w:shd w:fill="F2F6FA" w:color="auto" w:val="clear"/>
             <w:tcMar>
               <w:top w:type="dxa" w:w="60"/>
@@ -3263,7 +3366,36 @@
                 <w:sz w:val="19"/>
                 <w:szCs w:val="19"/>
               </w:rPr>
-              <w:t xml:space="preserve">Streamlit web app opened in the browser; runs on your laptop</w:t>
+              <w:t xml:space="preserve">Zotero</w:t>
+            </w:r>
+          </w:p>
+        </w:tc>
+        <w:tc>
+          <w:tcPr>
+            <w:tcW w:type="dxa" w:w="6426"/>
+            <w:tcBorders>
+              <w:top w:val="single" w:color="BFBFBF" w:sz="4"/>
+              <w:left w:val="single" w:color="BFBFBF" w:sz="4"/>
+              <w:bottom w:val="single" w:color="BFBFBF" w:sz="4"/>
+              <w:right w:val="single" w:color="BFBFBF" w:sz="4"/>
+            </w:tcBorders>
+            <w:shd w:fill="F2F6FA" w:color="auto" w:val="clear"/>
+            <w:tcMar>
+              <w:top w:type="dxa" w:w="60"/>
+              <w:left w:type="dxa" w:w="100"/>
+              <w:bottom w:type="dxa" w:w="60"/>
+              <w:right w:type="dxa" w:w="100"/>
+            </w:tcMar>
+          </w:tcPr>
+          <w:p>
+            <w:r>
+              <w:rPr>
+                <w:b w:val="false"/>
+                <w:bCs w:val="false"/>
+                <w:sz w:val="19"/>
+                <w:szCs w:val="19"/>
+              </w:rPr>
+              <w:t xml:space="preserve">Zotero is the reference manager. Records go to a named Zotero collection through the Zotero web API (free personal key), with RIS export as a fallback. Existing Zotero collections can also be pulled into a project</w:t>
             </w:r>
           </w:p>
         </w:tc>
@@ -3808,7 +3940,7 @@
                 <w:sz w:val="19"/>
                 <w:szCs w:val="19"/>
               </w:rPr>
-              <w:t xml:space="preserve">Projects, question to search strategy, PubMed search, logging, AI screening with confirm view, RIS and Excel export</w:t>
+              <w:t xml:space="preserve">Windows installer and shortcut, projects, question to PCC search strategy, PubMed search, logging, AI screening with confirm view, send to Zotero, Excel export</w:t>
             </w:r>
           </w:p>
         </w:tc>
@@ -3899,7 +4031,7 @@
                 <w:sz w:val="19"/>
                 <w:szCs w:val="19"/>
               </w:rPr>
-              <w:t xml:space="preserve">Europe PMC and OpenAlex, file import, deduplication, full text retrieval and upload, extraction form with quotes</w:t>
+              <w:t xml:space="preserve">Europe PMC and OpenAlex, file import (including African Journals Online and Google Scholar exports), deduplication, full text retrieval and upload, charting form with quotes</w:t>
             </w:r>
           </w:p>
         </w:tc>
@@ -3989,7 +4121,7 @@
                 <w:sz w:val="19"/>
                 <w:szCs w:val="19"/>
               </w:rPr>
-              <w:t xml:space="preserve">Citation chasing, weekly watch, PRISMA diagram</w:t>
+              <w:t xml:space="preserve">Citation chasing, weekly watch, PRISMA-ScR diagram</w:t>
             </w:r>
           </w:p>
         </w:tc>
@@ -4276,7 +4408,105 @@
         <w:spacing w:after="120" w:before="320"/>
       </w:pPr>
       <w:r>
-        <w:t xml:space="preserve">12. Decisions still needed</w:t>
+        <w:t xml:space="preserve">12. Decisions</w:t>
+      </w:r>
+    </w:p>
+    <w:p>
+      <w:pPr>
+        <w:pStyle w:val="Heading2"/>
+        <w:spacing w:after="80" w:before="200"/>
+      </w:pPr>
+      <w:r>
+        <w:t xml:space="preserve">Made</w:t>
+      </w:r>
+    </w:p>
+    <w:p>
+      <w:pPr>
+        <w:pStyle w:val="ListParagraph"/>
+        <w:numPr>
+          <w:ilvl w:val="0"/>
+          <w:numId w:val="2"/>
+        </w:numPr>
+        <w:spacing w:after="60"/>
+      </w:pPr>
+      <w:r>
+        <w:rPr>
+          <w:b/>
+          <w:bCs/>
+        </w:rPr>
+        <w:t xml:space="preserve">Computer:</w:t>
+      </w:r>
+      <w:r>
+        <w:t xml:space="preserve"> Windows laptop.</w:t>
+      </w:r>
+    </w:p>
+    <w:p>
+      <w:pPr>
+        <w:pStyle w:val="ListParagraph"/>
+        <w:numPr>
+          <w:ilvl w:val="0"/>
+          <w:numId w:val="2"/>
+        </w:numPr>
+        <w:spacing w:after="60"/>
+      </w:pPr>
+      <w:r>
+        <w:rPr>
+          <w:b/>
+          <w:bCs/>
+        </w:rPr>
+        <w:t xml:space="preserve">Reference manager:</w:t>
+      </w:r>
+      <w:r>
+        <w:t xml:space="preserve"> Zotero.</w:t>
+      </w:r>
+    </w:p>
+    <w:p>
+      <w:pPr>
+        <w:pStyle w:val="ListParagraph"/>
+        <w:numPr>
+          <w:ilvl w:val="0"/>
+          <w:numId w:val="2"/>
+        </w:numPr>
+        <w:spacing w:after="60"/>
+      </w:pPr>
+      <w:r>
+        <w:rPr>
+          <w:b/>
+          <w:bCs/>
+        </w:rPr>
+        <w:t xml:space="preserve">Databases:</w:t>
+      </w:r>
+      <w:r>
+        <w:t xml:space="preserve"> no Scopus or Web of Science for now; PubMed, Europe PMC, OpenAlex and manual imports cover version 1.</w:t>
+      </w:r>
+    </w:p>
+    <w:p>
+      <w:pPr>
+        <w:pStyle w:val="ListParagraph"/>
+        <w:numPr>
+          <w:ilvl w:val="0"/>
+          <w:numId w:val="2"/>
+        </w:numPr>
+        <w:spacing w:after="60"/>
+      </w:pPr>
+      <w:r>
+        <w:rPr>
+          <w:b/>
+          <w:bCs/>
+        </w:rPr>
+        <w:t xml:space="preserve">Objective 1:</w:t>
+      </w:r>
+      <w:r>
+        <w:t xml:space="preserve"> scoping review, JBI method, PRISMA-ScR reporting, protocol on OSF.</w:t>
+      </w:r>
+    </w:p>
+    <w:p>
+      <w:pPr>
+        <w:pStyle w:val="Heading2"/>
+        <w:spacing w:after="80" w:before="200"/>
+      </w:pPr>
+      <w:r>
+        <w:t xml:space="preserve">Still open</w:t>
       </w:r>
     </w:p>
     <w:p>
@@ -4289,7 +4519,7 @@
         <w:spacing w:after="60"/>
       </w:pPr>
       <w:r>
-        <w:t xml:space="preserve">Laptop operating system (Windows or Mac), so installation steps can be written for it.</w:t>
+        <w:t xml:space="preserve">Anthropic API key and a monthly spending limit you are comfortable with.</w:t>
       </w:r>
     </w:p>
     <w:p>
@@ -4302,7 +4532,7 @@
         <w:spacing w:after="60"/>
       </w:pPr>
       <w:r>
-        <w:t xml:space="preserve">Reference manager to target first (Zotero is recommended; it is free and imports RIS cleanly).</w:t>
+        <w:t xml:space="preserve">Second screener for Objective 1. JBI recommends two reviewers; a colleague or supervisor screening a sample of records would satisfy most examiners. The app can support this later.</w:t>
       </w:r>
     </w:p>
     <w:p>
@@ -4315,46 +4545,7 @@
         <w:spacing w:after="60"/>
       </w:pPr>
       <w:r>
-        <w:t xml:space="preserve">Whether your university provides Scopus or Web of Science access.</w:t>
-      </w:r>
-    </w:p>
-    <w:p>
-      <w:pPr>
-        <w:pStyle w:val="ListParagraph"/>
-        <w:numPr>
-          <w:ilvl w:val="0"/>
-          <w:numId w:val="4"/>
-        </w:numPr>
-        <w:spacing w:after="60"/>
-      </w:pPr>
-      <w:r>
-        <w:t xml:space="preserve">Anthropic API key and a monthly spending limit you are comfortable with.</w:t>
-      </w:r>
-    </w:p>
-    <w:p>
-      <w:pPr>
-        <w:pStyle w:val="ListParagraph"/>
-        <w:numPr>
-          <w:ilvl w:val="0"/>
-          <w:numId w:val="4"/>
-        </w:numPr>
-        <w:spacing w:after="60"/>
-      </w:pPr>
-      <w:r>
-        <w:t xml:space="preserve">Objective 1 review type (scoping or systematic) and whether it will be registered on PROSPERO or OSF.</w:t>
-      </w:r>
-    </w:p>
-    <w:p>
-      <w:pPr>
-        <w:pStyle w:val="ListParagraph"/>
-        <w:numPr>
-          <w:ilvl w:val="0"/>
-          <w:numId w:val="4"/>
-        </w:numPr>
-        <w:spacing w:after="60"/>
-      </w:pPr>
-      <w:r>
-        <w:t xml:space="preserve">Second screener for Objective 1, for example a colleague or supervisor on a sample, since systematic reviews normally expect dual screening. The app can support this later.</w:t>
+        <w:t xml:space="preserve">Whether to register the Objective 1 protocol on OSF before screening starts (recommended).</w:t>
       </w:r>
     </w:p>
     <w:p>

</xml_diff>